<commit_message>
Release Canary CMS v2.0.0.
Co-authored-by: Cursor <cursoragent@cursor.com>
</commit_message>
<xml_diff>
--- a/backend/precedents_seed/bundle/g0_blank_letter.docx
+++ b/backend/precedents_seed/bundle/g0_blank_letter.docx
@@ -13,13 +13,11 @@
         <w:t>[ORG_AND_ADDRESS_BLOCK]</w:t>
       </w:r>
     </w:p>
-    <w:p/>
     <w:p>
       <w:r>
         <w:t>[DATE]</w:t>
       </w:r>
     </w:p>
-    <w:p/>
     <w:p>
       <w:r>
         <w:t>Your Ref: [CONTACT_REF]</w:t>
@@ -30,7 +28,6 @@
         <w:t>Our Ref: [FEE_EARNER_INITIALS]/[CASE_REF]</w:t>
       </w:r>
     </w:p>
-    <w:p/>
     <w:p>
       <w:r>
         <w:t>[PRIMARY_CLIENT_LETTER_DEAR]</w:t>
@@ -51,13 +48,11 @@
         <w:t>[SOLICITOR_YOUR_CLIENT_LINE]</w:t>
       </w:r>
     </w:p>
-    <w:p/>
     <w:p>
       <w:r>
         <w:t>[PRECEDENT_BODY]</w:t>
       </w:r>
     </w:p>
-    <w:p/>
     <w:p>
       <w:r>
         <w:t>Yours sincerely,</w:t>
@@ -66,7 +61,17 @@
     <w:p/>
     <w:p>
       <w:r>
+        <w:t>[FEE_EARNER_SIGNATURE]</w:t>
+      </w:r>
+    </w:p>
+    <w:p>
+      <w:r>
         <w:t>[FEE_EARNER]</w:t>
+      </w:r>
+    </w:p>
+    <w:p>
+      <w:r>
+        <w:t>[FEE_EARNER_JOB_TITLE]</w:t>
       </w:r>
     </w:p>
     <w:p>

</xml_diff>